<commit_message>
Revisión U04: VLANs y STP corregidos, CEs RA5 alineados y Port Security movida a ACL
</commit_message>
<xml_diff>
--- a/docx/04-switching/04-switching.docx
+++ b/docx/04-switching/04-switching.docx
@@ -126,7 +126,7 @@
         <w:t xml:space="preserve"> </w:t>
       </w:r>
       <w:r>
-        <w:t xml:space="preserve">diste a los equipos direcciones; aquí el switch aprende a entregarlas trama a trama: cómo aprende MACs, qué son los dominios de colisión y broadcast, por qué STP salva la red de sí misma y cómo las VLANs parten un switch físico en varios lógicos. La primera mitad del curso se cierra aquí; la</w:t>
+        <w:t xml:space="preserve">diste a los equipos direcciones; aquí el switch aprende a entregarlas trama a trama: cómo aprende MACs, qué son los dominios de colisión y broadcast, por qué STP salva la red de sí misma y cómo las VLANs parten un switch físico en varios lógicos. Los fundamentos del switch se cierran aquí; la</w:t>
       </w:r>
       <w:r>
         <w:t xml:space="preserve"> </w:t>
@@ -816,7 +816,7 @@
         <w:pStyle w:val="BlockText"/>
       </w:pPr>
       <w:r>
-        <w:t xml:space="preserve">Practica con los pares del curso: empezar siempre el resuelto para ver el estilo y luego intentar el por-resolver.</w:t>
+        <w:t xml:space="preserve">Practica con los pares del curso: mira 1-2 resueltos para coger el formato, luego intenta el por-resolver; consulta el resuelto solo cuando te atasques.</w:t>
       </w:r>
     </w:p>
     <w:p>
@@ -955,29 +955,29 @@
               <w:pStyle w:val="Compact"/>
             </w:pPr>
             <w:r>
-              <w:t xml:space="preserve">RA5</w:t>
-            </w:r>
-          </w:p>
-        </w:tc>
-        <w:tc>
-          <w:tcPr/>
-          <w:p>
-            <w:pPr>
-              <w:pStyle w:val="Compact"/>
-            </w:pPr>
-            <w:r>
-              <w:t xml:space="preserve">Segmentación y reducción de dominios</w:t>
-            </w:r>
-          </w:p>
-        </w:tc>
-        <w:tc>
-          <w:tcPr/>
-          <w:p>
-            <w:pPr>
-              <w:pStyle w:val="Compact"/>
-            </w:pPr>
-            <w:r>
-              <w:t xml:space="preserve">✅ Puntos 3-4 y 8-9 + 🧠 Atrévete a pensar (punto 10)</w:t>
+              <w:t xml:space="preserve">RA3·c)</w:t>
+            </w:r>
+          </w:p>
+        </w:tc>
+        <w:tc>
+          <w:tcPr/>
+          <w:p>
+            <w:pPr>
+              <w:pStyle w:val="Compact"/>
+            </w:pPr>
+            <w:r>
+              <w:t xml:space="preserve">Redundancia sin bucles (STP)</w:t>
+            </w:r>
+          </w:p>
+        </w:tc>
+        <w:tc>
+          <w:tcPr/>
+          <w:p>
+            <w:pPr>
+              <w:pStyle w:val="Compact"/>
+            </w:pPr>
+            <w:r>
+              <w:t xml:space="preserve">✅ Puntos 4-7 + 💬 Entrevista (punto 10)</w:t>
             </w:r>
           </w:p>
         </w:tc>
@@ -990,29 +990,204 @@
               <w:pStyle w:val="Compact"/>
             </w:pPr>
             <w:r>
-              <w:t xml:space="preserve">RA3·c)</w:t>
-            </w:r>
-          </w:p>
-        </w:tc>
-        <w:tc>
-          <w:tcPr/>
-          <w:p>
-            <w:pPr>
-              <w:pStyle w:val="Compact"/>
-            </w:pPr>
-            <w:r>
-              <w:t xml:space="preserve">Redundancia sin bucles (STP)</w:t>
-            </w:r>
-          </w:p>
-        </w:tc>
-        <w:tc>
-          <w:tcPr/>
-          <w:p>
-            <w:pPr>
-              <w:pStyle w:val="Compact"/>
-            </w:pPr>
-            <w:r>
-              <w:t xml:space="preserve">✅ Puntos 4-7 + 💬 Entrevista (punto 10)</w:t>
+              <w:t xml:space="preserve">RA5·a)</w:t>
+            </w:r>
+          </w:p>
+        </w:tc>
+        <w:tc>
+          <w:tcPr/>
+          <w:p>
+            <w:pPr>
+              <w:pStyle w:val="Compact"/>
+            </w:pPr>
+            <w:r>
+              <w:t xml:space="preserve">Ventajas de VLANs</w:t>
+            </w:r>
+          </w:p>
+        </w:tc>
+        <w:tc>
+          <w:tcPr/>
+          <w:p>
+            <w:pPr>
+              <w:pStyle w:val="Compact"/>
+            </w:pPr>
+            <w:r>
+              <w:t xml:space="preserve">✅ Puntos 3-4 y 8 (dominios y ventajas) + 🧠 Atrévete a pensar (punto 10)</w:t>
+            </w:r>
+          </w:p>
+        </w:tc>
+      </w:tr>
+      <w:tr>
+        <w:tc>
+          <w:tcPr/>
+          <w:p>
+            <w:pPr>
+              <w:pStyle w:val="Compact"/>
+            </w:pPr>
+            <w:r>
+              <w:t xml:space="preserve">RA5·b)</w:t>
+            </w:r>
+          </w:p>
+        </w:tc>
+        <w:tc>
+          <w:tcPr/>
+          <w:p>
+            <w:pPr>
+              <w:pStyle w:val="Compact"/>
+            </w:pPr>
+            <w:r>
+              <w:t xml:space="preserve">Implementación de VLANs</w:t>
+            </w:r>
+          </w:p>
+        </w:tc>
+        <w:tc>
+          <w:tcPr/>
+          <w:p>
+            <w:pPr>
+              <w:pStyle w:val="Compact"/>
+            </w:pPr>
+            <w:r>
+              <w:t xml:space="preserve">✅ Puntos 8-9 + ⚡ Laboratorio (punto 10)</w:t>
+            </w:r>
+          </w:p>
+        </w:tc>
+      </w:tr>
+      <w:tr>
+        <w:tc>
+          <w:tcPr/>
+          <w:p>
+            <w:pPr>
+              <w:pStyle w:val="Compact"/>
+            </w:pPr>
+            <w:r>
+              <w:t xml:space="preserve">RA5·c)</w:t>
+            </w:r>
+          </w:p>
+        </w:tc>
+        <w:tc>
+          <w:tcPr/>
+          <w:p>
+            <w:pPr>
+              <w:pStyle w:val="Compact"/>
+            </w:pPr>
+            <w:r>
+              <w:t xml:space="preserve">Diagnóstico de incidencias</w:t>
+            </w:r>
+          </w:p>
+        </w:tc>
+        <w:tc>
+          <w:tcPr/>
+          <w:p>
+            <w:pPr>
+              <w:pStyle w:val="Compact"/>
+            </w:pPr>
+            <w:r>
+              <w:t xml:space="preserve">✅ Fallo intencionado de native VLAN (punto 10)</w:t>
+            </w:r>
+          </w:p>
+        </w:tc>
+      </w:tr>
+      <w:tr>
+        <w:tc>
+          <w:tcPr/>
+          <w:p>
+            <w:pPr>
+              <w:pStyle w:val="Compact"/>
+            </w:pPr>
+            <w:r>
+              <w:t xml:space="preserve">RA5·d)</w:t>
+            </w:r>
+          </w:p>
+        </w:tc>
+        <w:tc>
+          <w:tcPr/>
+          <w:p>
+            <w:pPr>
+              <w:pStyle w:val="Compact"/>
+            </w:pPr>
+            <w:r>
+              <w:t xml:space="preserve">Enlaces troncales</w:t>
+            </w:r>
+          </w:p>
+        </w:tc>
+        <w:tc>
+          <w:tcPr/>
+          <w:p>
+            <w:pPr>
+              <w:pStyle w:val="Compact"/>
+            </w:pPr>
+            <w:r>
+              <w:t xml:space="preserve">✅ Punto 9 (nativa) + ⭐ y 🤬 CONRAD (punto 10)</w:t>
+            </w:r>
+          </w:p>
+        </w:tc>
+      </w:tr>
+      <w:tr>
+        <w:tc>
+          <w:tcPr/>
+          <w:p>
+            <w:pPr>
+              <w:pStyle w:val="Compact"/>
+            </w:pPr>
+            <w:r>
+              <w:t xml:space="preserve">RA5·e)</w:t>
+            </w:r>
+          </w:p>
+        </w:tc>
+        <w:tc>
+          <w:tcPr/>
+          <w:p>
+            <w:pPr>
+              <w:pStyle w:val="Compact"/>
+            </w:pPr>
+            <w:r>
+              <w:t xml:space="preserve">Inter-VLAN con router</w:t>
+            </w:r>
+          </w:p>
+        </w:tc>
+        <w:tc>
+          <w:tcPr/>
+          <w:p>
+            <w:pPr>
+              <w:pStyle w:val="Compact"/>
+            </w:pPr>
+            <w:r>
+              <w:t xml:space="preserve">✅ ⚡ Laboratorio, 🕵️ y 🧠 (punto 10)</w:t>
+            </w:r>
+          </w:p>
+        </w:tc>
+      </w:tr>
+      <w:tr>
+        <w:tc>
+          <w:tcPr/>
+          <w:p>
+            <w:pPr>
+              <w:pStyle w:val="Compact"/>
+            </w:pPr>
+            <w:r>
+              <w:t xml:space="preserve">RA5·f)</w:t>
+            </w:r>
+          </w:p>
+        </w:tc>
+        <w:tc>
+          <w:tcPr/>
+          <w:p>
+            <w:pPr>
+              <w:pStyle w:val="Compact"/>
+            </w:pPr>
+            <w:r>
+              <w:t xml:space="preserve">Protocolos centralizados (VTP)</w:t>
+            </w:r>
+          </w:p>
+        </w:tc>
+        <w:tc>
+          <w:tcPr/>
+          <w:p>
+            <w:pPr>
+              <w:pStyle w:val="Compact"/>
+            </w:pPr>
+            <w:r>
+              <w:t xml:space="preserve">✅ 🕵️, 🧠 y 💬 (punto 10)</w:t>
             </w:r>
           </w:p>
         </w:tc>
@@ -3351,7 +3526,36 @@
         <w:t xml:space="preserve">estáticas</w:t>
       </w:r>
       <w:r>
-        <w:t xml:space="preserve">: se configuran a mano (por ejemplo, la de un servidor) y no caducan. La entrada</w:t>
+        <w:t xml:space="preserve">: se configuran a mano (por ejemplo, la de un servidor) y no caducan. En la tabla verás además entradas con puerto</w:t>
+      </w:r>
+      <w:r>
+        <w:t xml:space="preserve"> </w:t>
+      </w:r>
+      <w:r>
+        <w:rPr>
+          <w:b/>
+          <w:bCs/>
+        </w:rPr>
+        <w:t xml:space="preserve">CPU</w:t>
+      </w:r>
+      <w:r>
+        <w:t xml:space="preserve">: son multicast de control que procesa el propio switch (por ejemplo, el tráfico de gestión). Fíjate en lo que</w:t>
+      </w:r>
+      <w:r>
+        <w:t xml:space="preserve"> </w:t>
+      </w:r>
+      <w:r>
+        <w:rPr>
+          <w:b/>
+          <w:bCs/>
+        </w:rPr>
+        <w:t xml:space="preserve">no</w:t>
+      </w:r>
+      <w:r>
+        <w:t xml:space="preserve"> </w:t>
+      </w:r>
+      <w:r>
+        <w:t xml:space="preserve">aparece:</w:t>
       </w:r>
       <w:r>
         <w:t xml:space="preserve"> </w:t>
@@ -3366,20 +3570,7 @@
         <w:t xml:space="preserve"> </w:t>
       </w:r>
       <w:r>
-        <w:t xml:space="preserve">apuntando a la CPU es la del</w:t>
-      </w:r>
-      <w:r>
-        <w:t xml:space="preserve"> </w:t>
-      </w:r>
-      <w:r>
-        <w:rPr>
-          <w:b/>
-          <w:bCs/>
-        </w:rPr>
-        <w:t xml:space="preserve">broadcast</w:t>
-      </w:r>
-      <w:r>
-        <w:t xml:space="preserve">: el switch siempre la procesa internamente además de reenviarla.</w:t>
+        <w:t xml:space="preserve">nunca se aprende, porque el broadcast no se memoriza en la tabla: se inunda por todos los puertos de la VLAN por definición.</w:t>
       </w:r>
     </w:p>
     <w:p>
@@ -3668,7 +3859,7 @@
           <w:rPr>
             <w:rStyle w:val="Hyperlink"/>
           </w:rPr>
-          <w:t xml:space="preserve">punto 8</w:t>
+          <w:t xml:space="preserve">punto 5 de ACL y seguridad</w:t>
         </w:r>
       </w:hyperlink>
       <w:r>
@@ -4156,7 +4347,7 @@
     </w:p>
     <w:bookmarkEnd w:id="43"/>
     <w:bookmarkEnd w:id="44"/>
-    <w:bookmarkStart w:id="52" w:name="dominios-de-colisión-y-broadcast"/>
+    <w:bookmarkStart w:id="53" w:name="dominios-de-colisión-y-broadcast"/>
     <w:p>
       <w:pPr>
         <w:pStyle w:val="Heading1"/>
@@ -4873,7 +5064,7 @@
       </w:r>
     </w:p>
     <w:bookmarkEnd w:id="47"/>
-    <w:bookmarkStart w:id="48" w:name="contar-dominios-el-examen-clásico"/>
+    <w:bookmarkStart w:id="49" w:name="contar-dominios-el-examen-clásico"/>
     <w:p>
       <w:pPr>
         <w:pStyle w:val="Heading2"/>
@@ -5026,17 +5217,17 @@
         <w:t xml:space="preserve"> </w:t>
       </w:r>
       <w:r>
-        <w:t xml:space="preserve">un switch conectado a otro switch NO crea un dominio de broadcast nuevo: siguen siendo uno solo. Solo el router (o un switch de capa 3 con SVIs, como verás en la</w:t>
-      </w:r>
-      <w:r>
-        <w:t xml:space="preserve"> </w:t>
-      </w:r>
-      <w:hyperlink r:id="rId19">
+        <w:t xml:space="preserve">un switch conectado a otro switch NO crea un dominio de broadcast nuevo: siguen siendo uno solo. Solo el router (o un switch de capa 3 con SVIs, como verás en</w:t>
+      </w:r>
+      <w:r>
+        <w:t xml:space="preserve"> </w:t>
+      </w:r>
+      <w:hyperlink r:id="rId48">
         <w:r>
           <w:rPr>
             <w:rStyle w:val="Hyperlink"/>
           </w:rPr>
-          <w:t xml:space="preserve">unidad de switching</w:t>
+          <w:t xml:space="preserve">trunking e inter-VLAN</w:t>
         </w:r>
       </w:hyperlink>
       <w:r>
@@ -5050,8 +5241,8 @@
         </w:pict>
       </w:r>
     </w:p>
-    <w:bookmarkEnd w:id="48"/>
-    <w:bookmarkStart w:id="49" w:name="mini-chequeo-2"/>
+    <w:bookmarkEnd w:id="49"/>
+    <w:bookmarkStart w:id="50" w:name="mini-chequeo-2"/>
     <w:p>
       <w:pPr>
         <w:pStyle w:val="Heading2"/>
@@ -5195,8 +5386,8 @@
         </w:pict>
       </w:r>
     </w:p>
-    <w:bookmarkEnd w:id="49"/>
-    <w:bookmarkStart w:id="50" w:name="resumen-en-3-frases-2"/>
+    <w:bookmarkEnd w:id="50"/>
+    <w:bookmarkStart w:id="51" w:name="resumen-en-3-frases-2"/>
     <w:p>
       <w:pPr>
         <w:pStyle w:val="Heading2"/>
@@ -5273,8 +5464,8 @@
         <w:t xml:space="preserve">Contar dominios es la pregunta estrella de exámenes: hub = colisión global, switch = por puerto, router = parte el broadcast.</w:t>
       </w:r>
     </w:p>
-    <w:bookmarkEnd w:id="50"/>
-    <w:bookmarkStart w:id="51" w:name="vocabulario-rápido-2"/>
+    <w:bookmarkEnd w:id="51"/>
+    <w:bookmarkStart w:id="52" w:name="vocabulario-rápido-2"/>
     <w:p>
       <w:pPr>
         <w:pStyle w:val="Heading2"/>
@@ -5558,9 +5749,9 @@
         </w:r>
       </w:hyperlink>
     </w:p>
-    <w:bookmarkEnd w:id="51"/>
     <w:bookmarkEnd w:id="52"/>
-    <w:bookmarkStart w:id="61" w:name="la-tormenta-de-broadcast"/>
+    <w:bookmarkEnd w:id="53"/>
+    <w:bookmarkStart w:id="62" w:name="la-tormenta-de-broadcast"/>
     <w:p>
       <w:pPr>
         <w:pStyle w:val="Heading1"/>
@@ -5624,7 +5815,7 @@
         </w:pict>
       </w:r>
     </w:p>
-    <w:bookmarkStart w:id="53" w:name="la-idea-en-una-frase-3"/>
+    <w:bookmarkStart w:id="54" w:name="la-idea-en-una-frase-3"/>
     <w:p>
       <w:pPr>
         <w:pStyle w:val="Heading2"/>
@@ -5690,8 +5881,8 @@
         </w:pict>
       </w:r>
     </w:p>
-    <w:bookmarkEnd w:id="53"/>
-    <w:bookmarkStart w:id="54" w:name="cómo-se-forma-un-bucle"/>
+    <w:bookmarkEnd w:id="54"/>
+    <w:bookmarkStart w:id="55" w:name="cómo-se-forma-un-bucle"/>
     <w:p>
       <w:pPr>
         <w:pStyle w:val="Heading2"/>
@@ -5787,8 +5978,8 @@
         </w:pict>
       </w:r>
     </w:p>
-    <w:bookmarkEnd w:id="54"/>
-    <w:bookmarkStart w:id="55" w:name="la-tormenta-paso-a-paso"/>
+    <w:bookmarkEnd w:id="55"/>
+    <w:bookmarkStart w:id="56" w:name="la-tormenta-paso-a-paso"/>
     <w:p>
       <w:pPr>
         <w:pStyle w:val="Heading2"/>
@@ -6013,8 +6204,8 @@
         </w:pict>
       </w:r>
     </w:p>
-    <w:bookmarkEnd w:id="55"/>
-    <w:bookmarkStart w:id="56" w:name="síntomas-de-una-tormenta"/>
+    <w:bookmarkEnd w:id="56"/>
+    <w:bookmarkStart w:id="57" w:name="síntomas-de-una-tormenta"/>
     <w:p>
       <w:pPr>
         <w:pStyle w:val="Heading2"/>
@@ -6216,8 +6407,8 @@
         </w:pict>
       </w:r>
     </w:p>
-    <w:bookmarkEnd w:id="56"/>
-    <w:bookmarkStart w:id="57" w:name="la-solución-stp"/>
+    <w:bookmarkEnd w:id="57"/>
+    <w:bookmarkStart w:id="58" w:name="la-solución-stp"/>
     <w:p>
       <w:pPr>
         <w:pStyle w:val="Heading2"/>
@@ -6364,8 +6555,8 @@
         </w:pict>
       </w:r>
     </w:p>
-    <w:bookmarkEnd w:id="57"/>
-    <w:bookmarkStart w:id="58" w:name="mini-chequeo-3"/>
+    <w:bookmarkEnd w:id="58"/>
+    <w:bookmarkStart w:id="59" w:name="mini-chequeo-3"/>
     <w:p>
       <w:pPr>
         <w:pStyle w:val="Heading2"/>
@@ -6503,8 +6694,8 @@
         </w:pict>
       </w:r>
     </w:p>
-    <w:bookmarkEnd w:id="58"/>
-    <w:bookmarkStart w:id="59" w:name="resumen-en-3-frases-3"/>
+    <w:bookmarkEnd w:id="59"/>
+    <w:bookmarkStart w:id="60" w:name="resumen-en-3-frases-3"/>
     <w:p>
       <w:pPr>
         <w:pStyle w:val="Heading2"/>
@@ -6575,8 +6766,8 @@
         <w:t xml:space="preserve">: bloquear los caminos redundantes y solo activarlos si el principal falla.</w:t>
       </w:r>
     </w:p>
-    <w:bookmarkEnd w:id="59"/>
-    <w:bookmarkStart w:id="60" w:name="vocabulario-rápido-3"/>
+    <w:bookmarkEnd w:id="60"/>
+    <w:bookmarkStart w:id="61" w:name="vocabulario-rápido-3"/>
     <w:p>
       <w:pPr>
         <w:pStyle w:val="Heading2"/>
@@ -6824,9 +7015,9 @@
         </w:r>
       </w:hyperlink>
     </w:p>
-    <w:bookmarkEnd w:id="60"/>
     <w:bookmarkEnd w:id="61"/>
-    <w:bookmarkStart w:id="70" w:name="stp-fundamentos"/>
+    <w:bookmarkEnd w:id="62"/>
+    <w:bookmarkStart w:id="71" w:name="stp-fundamentos"/>
     <w:p>
       <w:pPr>
         <w:pStyle w:val="Heading1"/>
@@ -6890,7 +7081,7 @@
         </w:pict>
       </w:r>
     </w:p>
-    <w:bookmarkStart w:id="62" w:name="la-idea-en-una-frase-4"/>
+    <w:bookmarkStart w:id="63" w:name="la-idea-en-una-frase-4"/>
     <w:p>
       <w:pPr>
         <w:pStyle w:val="Heading2"/>
@@ -6964,7 +7155,18 @@
         <w:pStyle w:val="FirstParagraph"/>
       </w:pPr>
       <w:r>
-        <w:t xml:space="preserve">Es la pieza que nos faltaba del punto anterior: la tormenta de broadcast (punto 4) tiene cura, y esta es la vacuna.</w:t>
+        <w:t xml:space="preserve">Es la pieza que nos faltaba del punto anterior: la tormenta de broadcast (</w:t>
+      </w:r>
+      <w:hyperlink r:id="rId15">
+        <w:r>
+          <w:rPr>
+            <w:rStyle w:val="Hyperlink"/>
+          </w:rPr>
+          <w:t xml:space="preserve">punto 4</w:t>
+        </w:r>
+      </w:hyperlink>
+      <w:r>
+        <w:t xml:space="preserve">) tiene cura, y esta es la vacuna.</w:t>
       </w:r>
     </w:p>
     <w:p>
@@ -6974,8 +7176,8 @@
         </w:pict>
       </w:r>
     </w:p>
-    <w:bookmarkEnd w:id="62"/>
-    <w:bookmarkStart w:id="63" w:name="qué-hace-stp"/>
+    <w:bookmarkEnd w:id="63"/>
+    <w:bookmarkStart w:id="64" w:name="qué-hace-stp"/>
     <w:p>
       <w:pPr>
         <w:pStyle w:val="Heading2"/>
@@ -7167,8 +7369,8 @@
         </w:pict>
       </w:r>
     </w:p>
-    <w:bookmarkEnd w:id="63"/>
-    <w:bookmarkStart w:id="65" w:name="las-bpdus-el-idioma-de-stp"/>
+    <w:bookmarkEnd w:id="64"/>
+    <w:bookmarkStart w:id="66" w:name="las-bpdus-el-idioma-de-stp"/>
     <w:p>
       <w:pPr>
         <w:pStyle w:val="Heading2"/>
@@ -7546,7 +7748,7 @@
       <w:r>
         <w:t xml:space="preserve"> </w:t>
       </w:r>
-      <w:hyperlink r:id="rId64">
+      <w:hyperlink r:id="rId65">
         <w:r>
           <w:rPr>
             <w:rStyle w:val="Hyperlink"/>
@@ -7576,8 +7778,8 @@
         </w:pict>
       </w:r>
     </w:p>
-    <w:bookmarkEnd w:id="65"/>
-    <w:bookmarkStart w:id="66" w:name="la-elección-del-root-bridge"/>
+    <w:bookmarkEnd w:id="66"/>
+    <w:bookmarkStart w:id="67" w:name="la-elección-del-root-bridge"/>
     <w:p>
       <w:pPr>
         <w:pStyle w:val="Heading2"/>
@@ -7847,8 +8049,8 @@
         </w:pict>
       </w:r>
     </w:p>
-    <w:bookmarkEnd w:id="66"/>
-    <w:bookmarkStart w:id="67" w:name="mini-chequeo-4"/>
+    <w:bookmarkEnd w:id="67"/>
+    <w:bookmarkStart w:id="68" w:name="mini-chequeo-4"/>
     <w:p>
       <w:pPr>
         <w:pStyle w:val="Heading2"/>
@@ -7992,8 +8194,8 @@
         </w:pict>
       </w:r>
     </w:p>
-    <w:bookmarkEnd w:id="67"/>
-    <w:bookmarkStart w:id="68" w:name="resumen-en-3-frases-4"/>
+    <w:bookmarkEnd w:id="68"/>
+    <w:bookmarkStart w:id="69" w:name="resumen-en-3-frases-4"/>
     <w:p>
       <w:pPr>
         <w:pStyle w:val="Heading2"/>
@@ -8070,8 +8272,8 @@
         <w:t xml:space="preserve">usa el Bridge ID más bajo: prioridad primero, MAC como desempate.</w:t>
       </w:r>
     </w:p>
-    <w:bookmarkEnd w:id="68"/>
-    <w:bookmarkStart w:id="69" w:name="vocabulario-rápido-4"/>
+    <w:bookmarkEnd w:id="69"/>
+    <w:bookmarkStart w:id="70" w:name="vocabulario-rápido-4"/>
     <w:p>
       <w:pPr>
         <w:pStyle w:val="Heading2"/>
@@ -8342,9 +8544,9 @@
         </w:r>
       </w:hyperlink>
     </w:p>
-    <w:bookmarkEnd w:id="69"/>
     <w:bookmarkEnd w:id="70"/>
-    <w:bookmarkStart w:id="78" w:name="puertos-y-estados-stp"/>
+    <w:bookmarkEnd w:id="71"/>
+    <w:bookmarkStart w:id="79" w:name="puertos-y-estados-stp"/>
     <w:p>
       <w:pPr>
         <w:pStyle w:val="Heading1"/>
@@ -8408,7 +8610,7 @@
         </w:pict>
       </w:r>
     </w:p>
-    <w:bookmarkStart w:id="71" w:name="la-idea-en-una-frase-5"/>
+    <w:bookmarkStart w:id="72" w:name="la-idea-en-una-frase-5"/>
     <w:p>
       <w:pPr>
         <w:pStyle w:val="Heading2"/>
@@ -8481,8 +8683,8 @@
         </w:pict>
       </w:r>
     </w:p>
-    <w:bookmarkEnd w:id="71"/>
-    <w:bookmarkStart w:id="72" w:name="los-roles-de-puerto"/>
+    <w:bookmarkEnd w:id="72"/>
+    <w:bookmarkStart w:id="73" w:name="los-roles-de-puerto"/>
     <w:p>
       <w:pPr>
         <w:pStyle w:val="Heading2"/>
@@ -8891,8 +9093,8 @@
         </w:pict>
       </w:r>
     </w:p>
-    <w:bookmarkEnd w:id="72"/>
-    <w:bookmarkStart w:id="73" w:name="los-estados-de-puerto"/>
+    <w:bookmarkEnd w:id="73"/>
+    <w:bookmarkStart w:id="74" w:name="los-estados-de-puerto"/>
     <w:p>
       <w:pPr>
         <w:pStyle w:val="Heading2"/>
@@ -9320,8 +9522,8 @@
         </w:pict>
       </w:r>
     </w:p>
-    <w:bookmarkEnd w:id="73"/>
-    <w:bookmarkStart w:id="74" w:name="ver-el-estado-de-stp-en-cisco"/>
+    <w:bookmarkEnd w:id="74"/>
+    <w:bookmarkStart w:id="75" w:name="ver-el-estado-de-stp-en-cisco"/>
     <w:p>
       <w:pPr>
         <w:pStyle w:val="Heading2"/>
@@ -9505,8 +9707,8 @@
         </w:pict>
       </w:r>
     </w:p>
-    <w:bookmarkEnd w:id="74"/>
-    <w:bookmarkStart w:id="75" w:name="mini-chequeo-5"/>
+    <w:bookmarkEnd w:id="75"/>
+    <w:bookmarkStart w:id="76" w:name="mini-chequeo-5"/>
     <w:p>
       <w:pPr>
         <w:pStyle w:val="Heading2"/>
@@ -9641,8 +9843,8 @@
         </w:pict>
       </w:r>
     </w:p>
-    <w:bookmarkEnd w:id="75"/>
-    <w:bookmarkStart w:id="76" w:name="resumen-en-3-frases-5"/>
+    <w:bookmarkEnd w:id="76"/>
+    <w:bookmarkStart w:id="77" w:name="resumen-en-3-frases-5"/>
     <w:p>
       <w:pPr>
         <w:pStyle w:val="Heading2"/>
@@ -9687,8 +9889,8 @@
         <w:t xml:space="preserve">La convergencia STP de 30-50 s es lenta: es el motor de la evolución a RSTP.</w:t>
       </w:r>
     </w:p>
-    <w:bookmarkEnd w:id="76"/>
-    <w:bookmarkStart w:id="77" w:name="vocabulario-rápido-5"/>
+    <w:bookmarkEnd w:id="77"/>
+    <w:bookmarkStart w:id="78" w:name="vocabulario-rápido-5"/>
     <w:p>
       <w:pPr>
         <w:pStyle w:val="Heading2"/>
@@ -9983,9 +10185,9 @@
         </w:r>
       </w:hyperlink>
     </w:p>
-    <w:bookmarkEnd w:id="77"/>
     <w:bookmarkEnd w:id="78"/>
-    <w:bookmarkStart w:id="86" w:name="rstp-y-portfast"/>
+    <w:bookmarkEnd w:id="79"/>
+    <w:bookmarkStart w:id="87" w:name="rstp-y-portfast"/>
     <w:p>
       <w:pPr>
         <w:pStyle w:val="Heading1"/>
@@ -10049,7 +10251,7 @@
         </w:pict>
       </w:r>
     </w:p>
-    <w:bookmarkStart w:id="79" w:name="la-idea-en-una-frase-6"/>
+    <w:bookmarkStart w:id="80" w:name="la-idea-en-una-frase-6"/>
     <w:p>
       <w:pPr>
         <w:pStyle w:val="Heading2"/>
@@ -10141,8 +10343,8 @@
         </w:pict>
       </w:r>
     </w:p>
-    <w:bookmarkEnd w:id="79"/>
-    <w:bookmarkStart w:id="80" w:name="rstp-stp-con-prisa"/>
+    <w:bookmarkEnd w:id="80"/>
+    <w:bookmarkStart w:id="81" w:name="rstp-stp-con-prisa"/>
     <w:p>
       <w:pPr>
         <w:pStyle w:val="Heading2"/>
@@ -10506,7 +10708,8 @@
     <w:tbl>
       <w:tblPr>
         <w:tblStyle w:val="Table"/>
-        <w:tblW w:type="auto" w:w="0"/>
+        <w:tblW w:type="pct" w:w="5000"/>
+        <w:tblLayout w:type="fixed"/>
         <w:tblLook w:firstRow="1" w:lastRow="0" w:firstColumn="0" w:lastColumn="0" w:noHBand="0" w:noVBand="0" w:val="0020"/>
       </w:tblPr>
       <w:tblGrid>
@@ -10563,7 +10766,7 @@
               <w:pStyle w:val="Compact"/>
             </w:pPr>
             <w:r>
-              <w:t xml:space="preserve">Conectado a un PC/impresora (no aprende switches)</w:t>
+              <w:t xml:space="preserve">Conectado solo a extremos finales (nunca a otro switch)</w:t>
             </w:r>
           </w:p>
         </w:tc>
@@ -10632,8 +10835,8 @@
         </w:pict>
       </w:r>
     </w:p>
-    <w:bookmarkEnd w:id="80"/>
-    <w:bookmarkStart w:id="81" w:name="portfast-el-atajo-para-puertos-de-acceso"/>
+    <w:bookmarkEnd w:id="81"/>
+    <w:bookmarkStart w:id="82" w:name="portfast-el-atajo-para-puertos-de-acceso"/>
     <w:p>
       <w:pPr>
         <w:pStyle w:val="Heading2"/>
@@ -10831,8 +11034,8 @@
         </w:pict>
       </w:r>
     </w:p>
-    <w:bookmarkEnd w:id="81"/>
-    <w:bookmarkStart w:id="82" w:name="bpduguard-el-guardián-del-puerto"/>
+    <w:bookmarkEnd w:id="82"/>
+    <w:bookmarkStart w:id="83" w:name="bpduguard-el-guardián-del-puerto"/>
     <w:p>
       <w:pPr>
         <w:pStyle w:val="Heading2"/>
@@ -11032,7 +11235,7 @@
           <w:rPr>
             <w:rStyle w:val="Hyperlink"/>
           </w:rPr>
-          <w:t xml:space="preserve">punto 8</w:t>
+          <w:t xml:space="preserve">punto 5 de ACL y seguridad</w:t>
         </w:r>
       </w:hyperlink>
       <w:r>
@@ -11046,8 +11249,8 @@
         </w:pict>
       </w:r>
     </w:p>
-    <w:bookmarkEnd w:id="82"/>
-    <w:bookmarkStart w:id="83" w:name="mini-chequeo-6"/>
+    <w:bookmarkEnd w:id="83"/>
+    <w:bookmarkStart w:id="84" w:name="mini-chequeo-6"/>
     <w:p>
       <w:pPr>
         <w:pStyle w:val="Heading2"/>
@@ -11227,8 +11430,8 @@
         </w:pict>
       </w:r>
     </w:p>
-    <w:bookmarkEnd w:id="83"/>
-    <w:bookmarkStart w:id="84" w:name="resumen-en-3-frases-6"/>
+    <w:bookmarkEnd w:id="84"/>
+    <w:bookmarkStart w:id="85" w:name="resumen-en-3-frases-6"/>
     <w:p>
       <w:pPr>
         <w:pStyle w:val="Heading2"/>
@@ -11273,8 +11476,8 @@
         <w:t xml:space="preserve">BPDUGuard vigila los puertos PortFast y los deshabilita si detectan un switch: es la seguridad contra bucles silenciosos.</w:t>
       </w:r>
     </w:p>
-    <w:bookmarkEnd w:id="84"/>
-    <w:bookmarkStart w:id="85" w:name="vocabulario-rápido-6"/>
+    <w:bookmarkEnd w:id="85"/>
+    <w:bookmarkStart w:id="86" w:name="vocabulario-rápido-6"/>
     <w:p>
       <w:pPr>
         <w:pStyle w:val="Heading2"/>
@@ -11545,9 +11748,9 @@
         </w:r>
       </w:hyperlink>
     </w:p>
-    <w:bookmarkEnd w:id="85"/>
     <w:bookmarkEnd w:id="86"/>
-    <w:bookmarkStart w:id="97" w:name="qué-es-una-vlan"/>
+    <w:bookmarkEnd w:id="87"/>
+    <w:bookmarkStart w:id="101" w:name="qué-es-una-vlan"/>
     <w:p>
       <w:pPr>
         <w:pStyle w:val="Heading1"/>
@@ -11611,7 +11814,7 @@
         </w:pict>
       </w:r>
     </w:p>
-    <w:bookmarkStart w:id="87" w:name="la-idea-en-una-frase-7"/>
+    <w:bookmarkStart w:id="88" w:name="la-idea-en-una-frase-7"/>
     <w:p>
       <w:pPr>
         <w:pStyle w:val="Heading2"/>
@@ -11706,8 +11909,8 @@
         </w:pict>
       </w:r>
     </w:p>
-    <w:bookmarkEnd w:id="87"/>
-    <w:bookmarkStart w:id="88" w:name="X739d9d2696cfb64d816141fb13d80aef018417e"/>
+    <w:bookmarkEnd w:id="88"/>
+    <w:bookmarkStart w:id="89" w:name="X739d9d2696cfb64d816141fb13d80aef018417e"/>
     <w:p>
       <w:pPr>
         <w:pStyle w:val="Heading2"/>
@@ -11910,7 +12113,7 @@
         <w:pStyle w:val="BodyText"/>
       </w:pPr>
       <w:r>
-        <w:t xml:space="preserve">La tabla de ventajas que presentó la unidad anterior sigue siendo la carta de presentación de las VLANs:</w:t>
+        <w:t xml:space="preserve">Estas son las ventajas que convierten a la segmentación en la carta de presentación de las VLANs:</w:t>
       </w:r>
     </w:p>
     <w:tbl>
@@ -12167,8 +12370,8 @@
         </w:pict>
       </w:r>
     </w:p>
-    <w:bookmarkEnd w:id="88"/>
-    <w:bookmarkStart w:id="90" w:name="Xd3c52ab823c5cd7f458f745baf8bacb4eac16ad"/>
+    <w:bookmarkEnd w:id="89"/>
+    <w:bookmarkStart w:id="91" w:name="Xd3c52ab823c5cd7f458f745baf8bacb4eac16ad"/>
     <w:p>
       <w:pPr>
         <w:pStyle w:val="Heading2"/>
@@ -12443,7 +12646,7 @@
       <w:r>
         <w:t xml:space="preserve"> </w:t>
       </w:r>
-      <w:hyperlink r:id="rId89">
+      <w:hyperlink r:id="rId90">
         <w:r>
           <w:rPr>
             <w:rStyle w:val="Hyperlink"/>
@@ -12462,8 +12665,8 @@
         </w:pict>
       </w:r>
     </w:p>
-    <w:bookmarkEnd w:id="90"/>
-    <w:bookmarkStart w:id="92" w:name="vlan-1-la-que-viene-instalada-de-fábrica"/>
+    <w:bookmarkEnd w:id="91"/>
+    <w:bookmarkStart w:id="94" w:name="vlan-1-la-que-viene-instalada-de-fábrica"/>
     <w:p>
       <w:pPr>
         <w:pStyle w:val="Heading2"/>
@@ -12613,7 +12816,21 @@
               <w:pStyle w:val="Compact"/>
             </w:pPr>
             <w:r>
-              <w:t xml:space="preserve">VLAN 1 (la verás en el punto 3 de trunks)</w:t>
+              <w:t xml:space="preserve">VLAN 1 (la verás en</w:t>
+            </w:r>
+            <w:r>
+              <w:t xml:space="preserve"> </w:t>
+            </w:r>
+            <w:hyperlink r:id="rId92">
+              <w:r>
+                <w:rPr>
+                  <w:rStyle w:val="Hyperlink"/>
+                </w:rPr>
+                <w:t xml:space="preserve">trunking e inter-VLAN</w:t>
+              </w:r>
+            </w:hyperlink>
+            <w:r>
+              <w:t xml:space="preserve">)</w:t>
             </w:r>
           </w:p>
         </w:tc>
@@ -12681,7 +12898,7 @@
       <w:r>
         <w:t xml:space="preserve"> </w:t>
       </w:r>
-      <w:hyperlink r:id="rId91">
+      <w:hyperlink r:id="rId93">
         <w:r>
           <w:rPr>
             <w:rStyle w:val="Hyperlink"/>
@@ -12700,13 +12917,273 @@
         </w:pict>
       </w:r>
     </w:p>
-    <w:bookmarkEnd w:id="92"/>
-    <w:bookmarkStart w:id="93" w:name="los-tipos-de-vlan-a-vista-de-pájaro"/>
+    <w:bookmarkEnd w:id="94"/>
+    <w:bookmarkStart w:id="95" w:name="crear-una-vlan-en-tres-líneas"/>
     <w:p>
       <w:pPr>
         <w:pStyle w:val="Heading2"/>
       </w:pPr>
       <w:r>
+        <w:t xml:space="preserve">🛠️ Crear una VLAN en tres líneas</w:t>
+      </w:r>
+    </w:p>
+    <w:p>
+      <w:pPr>
+        <w:pStyle w:val="FirstParagraph"/>
+      </w:pPr>
+      <w:r>
+        <w:t xml:space="preserve">Para que la segmentación sea real hay que crear las VLANs y decirle a cada puerto a cuál pertenece. En un switch Cisco el proceso entero cabe en dos pasos:</w:t>
+      </w:r>
+    </w:p>
+    <w:p>
+      <w:pPr>
+        <w:pStyle w:val="SourceCode"/>
+      </w:pPr>
+      <w:r>
+        <w:rPr>
+          <w:rStyle w:val="ExtensionTok"/>
+        </w:rPr>
+        <w:t xml:space="preserve">Switch</w:t>
+      </w:r>
+      <w:r>
+        <w:rPr>
+          <w:rStyle w:val="ErrorTok"/>
+        </w:rPr>
+        <w:t xml:space="preserve">(</w:t>
+      </w:r>
+      <w:r>
+        <w:rPr>
+          <w:rStyle w:val="ExtensionTok"/>
+        </w:rPr>
+        <w:t xml:space="preserve">config</w:t>
+      </w:r>
+      <w:r>
+        <w:rPr>
+          <w:rStyle w:val="KeywordTok"/>
+        </w:rPr>
+        <w:t xml:space="preserve">)</w:t>
+      </w:r>
+      <w:r>
+        <w:rPr>
+          <w:rStyle w:val="CommentTok"/>
+        </w:rPr>
+        <w:t xml:space="preserve"># vlan 10</w:t>
+      </w:r>
+      <w:r>
+        <w:br/>
+      </w:r>
+      <w:r>
+        <w:rPr>
+          <w:rStyle w:val="ExtensionTok"/>
+        </w:rPr>
+        <w:t xml:space="preserve">Switch</w:t>
+      </w:r>
+      <w:r>
+        <w:rPr>
+          <w:rStyle w:val="ErrorTok"/>
+        </w:rPr>
+        <w:t xml:space="preserve">(</w:t>
+      </w:r>
+      <w:r>
+        <w:rPr>
+          <w:rStyle w:val="ExtensionTok"/>
+        </w:rPr>
+        <w:t xml:space="preserve">config-vlan</w:t>
+      </w:r>
+      <w:r>
+        <w:rPr>
+          <w:rStyle w:val="KeywordTok"/>
+        </w:rPr>
+        <w:t xml:space="preserve">)</w:t>
+      </w:r>
+      <w:r>
+        <w:rPr>
+          <w:rStyle w:val="CommentTok"/>
+        </w:rPr>
+        <w:t xml:space="preserve"># name Ventas</w:t>
+      </w:r>
+      <w:r>
+        <w:br/>
+      </w:r>
+      <w:r>
+        <w:rPr>
+          <w:rStyle w:val="ExtensionTok"/>
+        </w:rPr>
+        <w:t xml:space="preserve">Switch</w:t>
+      </w:r>
+      <w:r>
+        <w:rPr>
+          <w:rStyle w:val="ErrorTok"/>
+        </w:rPr>
+        <w:t xml:space="preserve">(</w:t>
+      </w:r>
+      <w:r>
+        <w:rPr>
+          <w:rStyle w:val="ExtensionTok"/>
+        </w:rPr>
+        <w:t xml:space="preserve">config-vlan</w:t>
+      </w:r>
+      <w:r>
+        <w:rPr>
+          <w:rStyle w:val="KeywordTok"/>
+        </w:rPr>
+        <w:t xml:space="preserve">)</w:t>
+      </w:r>
+      <w:r>
+        <w:rPr>
+          <w:rStyle w:val="CommentTok"/>
+        </w:rPr>
+        <w:t xml:space="preserve"># exit</w:t>
+      </w:r>
+      <w:r>
+        <w:br/>
+      </w:r>
+      <w:r>
+        <w:rPr>
+          <w:rStyle w:val="ExtensionTok"/>
+        </w:rPr>
+        <w:t xml:space="preserve">Switch</w:t>
+      </w:r>
+      <w:r>
+        <w:rPr>
+          <w:rStyle w:val="ErrorTok"/>
+        </w:rPr>
+        <w:t xml:space="preserve">(</w:t>
+      </w:r>
+      <w:r>
+        <w:rPr>
+          <w:rStyle w:val="ExtensionTok"/>
+        </w:rPr>
+        <w:t xml:space="preserve">config</w:t>
+      </w:r>
+      <w:r>
+        <w:rPr>
+          <w:rStyle w:val="KeywordTok"/>
+        </w:rPr>
+        <w:t xml:space="preserve">)</w:t>
+      </w:r>
+      <w:r>
+        <w:rPr>
+          <w:rStyle w:val="CommentTok"/>
+        </w:rPr>
+        <w:t xml:space="preserve"># interface range fa0/1-5</w:t>
+      </w:r>
+      <w:r>
+        <w:br/>
+      </w:r>
+      <w:r>
+        <w:rPr>
+          <w:rStyle w:val="ExtensionTok"/>
+        </w:rPr>
+        <w:t xml:space="preserve">Switch</w:t>
+      </w:r>
+      <w:r>
+        <w:rPr>
+          <w:rStyle w:val="ErrorTok"/>
+        </w:rPr>
+        <w:t xml:space="preserve">(</w:t>
+      </w:r>
+      <w:r>
+        <w:rPr>
+          <w:rStyle w:val="ExtensionTok"/>
+        </w:rPr>
+        <w:t xml:space="preserve">config-if-range</w:t>
+      </w:r>
+      <w:r>
+        <w:rPr>
+          <w:rStyle w:val="KeywordTok"/>
+        </w:rPr>
+        <w:t xml:space="preserve">)</w:t>
+      </w:r>
+      <w:r>
+        <w:rPr>
+          <w:rStyle w:val="CommentTok"/>
+        </w:rPr>
+        <w:t xml:space="preserve"># switchport mode access</w:t>
+      </w:r>
+      <w:r>
+        <w:br/>
+      </w:r>
+      <w:r>
+        <w:rPr>
+          <w:rStyle w:val="ExtensionTok"/>
+        </w:rPr>
+        <w:t xml:space="preserve">Switch</w:t>
+      </w:r>
+      <w:r>
+        <w:rPr>
+          <w:rStyle w:val="ErrorTok"/>
+        </w:rPr>
+        <w:t xml:space="preserve">(</w:t>
+      </w:r>
+      <w:r>
+        <w:rPr>
+          <w:rStyle w:val="ExtensionTok"/>
+        </w:rPr>
+        <w:t xml:space="preserve">config-if-range</w:t>
+      </w:r>
+      <w:r>
+        <w:rPr>
+          <w:rStyle w:val="KeywordTok"/>
+        </w:rPr>
+        <w:t xml:space="preserve">)</w:t>
+      </w:r>
+      <w:r>
+        <w:rPr>
+          <w:rStyle w:val="CommentTok"/>
+        </w:rPr>
+        <w:t xml:space="preserve"># switchport access vlan 10</w:t>
+      </w:r>
+    </w:p>
+    <w:p>
+      <w:pPr>
+        <w:pStyle w:val="FirstParagraph"/>
+      </w:pPr>
+      <w:r>
+        <w:t xml:space="preserve">El comando que no puede faltar es</w:t>
+      </w:r>
+      <w:r>
+        <w:t xml:space="preserve"> </w:t>
+      </w:r>
+      <w:r>
+        <w:rPr>
+          <w:rStyle w:val="VerbatimChar"/>
+        </w:rPr>
+        <w:t xml:space="preserve">switchport access vlan 10</w:t>
+      </w:r>
+      <w:r>
+        <w:t xml:space="preserve">: sin él, el puerto se queda en la VLAN por defecto (la 1). Para comprobarlo,</w:t>
+      </w:r>
+      <w:r>
+        <w:t xml:space="preserve"> </w:t>
+      </w:r>
+      <w:r>
+        <w:rPr>
+          <w:rStyle w:val="VerbatimChar"/>
+        </w:rPr>
+        <w:t xml:space="preserve">show vlan brief</w:t>
+      </w:r>
+      <w:r>
+        <w:t xml:space="preserve"> </w:t>
+      </w:r>
+      <w:r>
+        <w:t xml:space="preserve">lista todas las VLANs del switch y qué puertos tiene asignados cada una. Con eso ya tienes una VLAN funcionando; sacarla fuera del switch (trunks) llega en la unidad siguiente.</w:t>
+      </w:r>
+    </w:p>
+    <w:p>
+      <w:r>
+        <w:pict>
+          <v:rect style="width:0;height:1.5pt" o:hralign="center" o:hrstd="t" o:hr="t"/>
+        </w:pict>
+      </w:r>
+    </w:p>
+    <w:bookmarkEnd w:id="95"/>
+    <w:bookmarkStart w:id="96" w:name="los-tipos-de-vlan-a-vista-de-pájaro"/>
+    <w:p>
+      <w:pPr>
+        <w:pStyle w:val="Heading2"/>
+      </w:pPr>
+      <w:r>
         <w:t xml:space="preserve">🏷️ Los tipos de VLAN a vista de pájaro</w:t>
       </w:r>
     </w:p>
@@ -12720,12 +13197,12 @@
       <w:r>
         <w:t xml:space="preserve"> </w:t>
       </w:r>
-      <w:hyperlink r:id="rId19">
+      <w:hyperlink r:id="rId20">
         <w:r>
           <w:rPr>
             <w:rStyle w:val="Hyperlink"/>
           </w:rPr>
-          <w:t xml:space="preserve">punto 2</w:t>
+          <w:t xml:space="preserve">punto 9</w:t>
         </w:r>
       </w:hyperlink>
       <w:r>
@@ -13010,8 +13487,8 @@
         </w:pict>
       </w:r>
     </w:p>
-    <w:bookmarkEnd w:id="93"/>
-    <w:bookmarkStart w:id="94" w:name="mini-chequeo-7"/>
+    <w:bookmarkEnd w:id="96"/>
+    <w:bookmarkStart w:id="98" w:name="mini-chequeo-7"/>
     <w:p>
       <w:pPr>
         <w:pStyle w:val="Heading2"/>
@@ -13136,7 +13613,21 @@
         <w:t xml:space="preserve"> </w:t>
       </w:r>
       <w:r>
-        <w:t xml:space="preserve">Las VLANs aíslan en capa 2: el switch no reenvía tramas entre VLANs. Para comunicarse necesitan un router o un switch de capa 3 (lo verás en los puntos 4 y 5).</w:t>
+        <w:t xml:space="preserve">Las VLANs aíslan en capa 2: el switch no reenvía tramas entre VLANs. Para comunicarse necesitan un router o un switch de capa 3 (lo verás en</w:t>
+      </w:r>
+      <w:r>
+        <w:t xml:space="preserve"> </w:t>
+      </w:r>
+      <w:hyperlink r:id="rId97">
+        <w:r>
+          <w:rPr>
+            <w:rStyle w:val="Hyperlink"/>
+          </w:rPr>
+          <w:t xml:space="preserve">trunking e inter-VLAN</w:t>
+        </w:r>
+      </w:hyperlink>
+      <w:r>
+        <w:t xml:space="preserve">).</w:t>
       </w:r>
     </w:p>
     <w:p>
@@ -13146,8 +13637,8 @@
         </w:pict>
       </w:r>
     </w:p>
-    <w:bookmarkEnd w:id="94"/>
-    <w:bookmarkStart w:id="95" w:name="resumen-en-3-frases-7"/>
+    <w:bookmarkEnd w:id="98"/>
+    <w:bookmarkStart w:id="99" w:name="resumen-en-3-frases-7"/>
     <w:p>
       <w:pPr>
         <w:pStyle w:val="Heading2"/>
@@ -13237,8 +13728,8 @@
         <w:t xml:space="preserve">es la de fábrica y conviene reservarla: los datos deben vivir en VLANs dedicadas.</w:t>
       </w:r>
     </w:p>
-    <w:bookmarkEnd w:id="95"/>
-    <w:bookmarkStart w:id="96" w:name="vocabulario-rápido-7"/>
+    <w:bookmarkEnd w:id="99"/>
+    <w:bookmarkStart w:id="100" w:name="vocabulario-rápido-7"/>
     <w:p>
       <w:pPr>
         <w:pStyle w:val="Heading2"/>
@@ -13486,9 +13977,9 @@
         </w:r>
       </w:hyperlink>
     </w:p>
-    <w:bookmarkEnd w:id="96"/>
-    <w:bookmarkEnd w:id="97"/>
-    <w:bookmarkStart w:id="110" w:name="tipos-de-vlan"/>
+    <w:bookmarkEnd w:id="100"/>
+    <w:bookmarkEnd w:id="101"/>
+    <w:bookmarkStart w:id="114" w:name="tipos-de-vlan"/>
     <w:p>
       <w:pPr>
         <w:pStyle w:val="Heading1"/>
@@ -13552,7 +14043,7 @@
         </w:pict>
       </w:r>
     </w:p>
-    <w:bookmarkStart w:id="98" w:name="la-idea-en-una-frase-8"/>
+    <w:bookmarkStart w:id="102" w:name="la-idea-en-una-frase-8"/>
     <w:p>
       <w:pPr>
         <w:pStyle w:val="Heading2"/>
@@ -13622,7 +14113,7 @@
         <w:pStyle w:val="FirstParagraph"/>
       </w:pPr>
       <w:r>
-        <w:t xml:space="preserve">En el punto 1 viste el concepto y la motivación. Aquí te llevas el mapa completo de qué tipos de VLAN existen y cuándo usar cada uno. Este vocabulario es oro en una entrevista:</w:t>
+        <w:t xml:space="preserve">En el punto 8 viste el concepto y la motivación. Aquí te llevas el mapa completo de qué tipos de VLAN existen y cuándo usar cada uno. Este vocabulario es oro en una entrevista:</w:t>
       </w:r>
       <w:r>
         <w:t xml:space="preserve"> </w:t>
@@ -13644,8 +14135,8 @@
         </w:pict>
       </w:r>
     </w:p>
-    <w:bookmarkEnd w:id="98"/>
-    <w:bookmarkStart w:id="103" w:name="los-cuatro-tipos-clásicos-de-vlan"/>
+    <w:bookmarkEnd w:id="102"/>
+    <w:bookmarkStart w:id="107" w:name="los-cuatro-tipos-clásicos-de-vlan"/>
     <w:p>
       <w:pPr>
         <w:pStyle w:val="Heading2"/>
@@ -13925,7 +14416,7 @@
         </w:tc>
       </w:tr>
     </w:tbl>
-    <w:bookmarkStart w:id="99" w:name="vlan-de-datos"/>
+    <w:bookmarkStart w:id="103" w:name="vlan-de-datos"/>
     <w:p>
       <w:pPr>
         <w:pStyle w:val="Heading3"/>
@@ -13942,8 +14433,8 @@
         <w:t xml:space="preserve">Es la que transporta el tráfico del día a día: navegación, correo, impresoras, copias de seguridad de archivos. Cada departamento o función suele tener la suya (Ventas = 10, RRHH = 20, IT = 30…). Es la VLAN por defecto donde acaba todo lo que no se configura para otra cosa.</w:t>
       </w:r>
     </w:p>
-    <w:bookmarkEnd w:id="99"/>
-    <w:bookmarkStart w:id="100" w:name="vlan-nativa"/>
+    <w:bookmarkEnd w:id="103"/>
+    <w:bookmarkStart w:id="104" w:name="vlan-nativa"/>
     <w:p>
       <w:pPr>
         <w:pStyle w:val="Heading3"/>
@@ -13957,7 +14448,21 @@
         <w:pStyle w:val="FirstParagraph"/>
       </w:pPr>
       <w:r>
-        <w:t xml:space="preserve">Es la VLAN especial del trunk (punto 3). En un enlace troncal,</w:t>
+        <w:t xml:space="preserve">Es la VLAN especial del trunk (la ves en</w:t>
+      </w:r>
+      <w:r>
+        <w:t xml:space="preserve"> </w:t>
+      </w:r>
+      <w:hyperlink r:id="rId92">
+        <w:r>
+          <w:rPr>
+            <w:rStyle w:val="Hyperlink"/>
+          </w:rPr>
+          <w:t xml:space="preserve">trunking e inter-VLAN</w:t>
+        </w:r>
+      </w:hyperlink>
+      <w:r>
+        <w:t xml:space="preserve">). En un enlace troncal,</w:t>
       </w:r>
       <w:r>
         <w:t xml:space="preserve"> </w:t>
@@ -13988,8 +14493,8 @@
         <w:t xml:space="preserve">en VLANs diferentes a cada lado y se producen fallos de conectividad (o ataques de double tagging).</w:t>
       </w:r>
     </w:p>
-    <w:bookmarkEnd w:id="100"/>
-    <w:bookmarkStart w:id="101" w:name="vlan-de-voz"/>
+    <w:bookmarkEnd w:id="104"/>
+    <w:bookmarkStart w:id="105" w:name="vlan-de-voz"/>
     <w:p>
       <w:pPr>
         <w:pStyle w:val="Heading3"/>
@@ -14053,8 +14558,8 @@
         <w:t xml:space="preserve">para que la VLAN de voz se configure sola sobre la de datos.</w:t>
       </w:r>
     </w:p>
-    <w:bookmarkEnd w:id="101"/>
-    <w:bookmarkStart w:id="102" w:name="vlan-de-gestión"/>
+    <w:bookmarkEnd w:id="105"/>
+    <w:bookmarkStart w:id="106" w:name="vlan-de-gestión"/>
     <w:p>
       <w:pPr>
         <w:pStyle w:val="Heading3"/>
@@ -14132,9 +14637,9 @@
         </w:pict>
       </w:r>
     </w:p>
-    <w:bookmarkEnd w:id="102"/>
-    <w:bookmarkEnd w:id="103"/>
-    <w:bookmarkStart w:id="104" w:name="vlan-estática-vs-vlan-dinámica"/>
+    <w:bookmarkEnd w:id="106"/>
+    <w:bookmarkEnd w:id="107"/>
+    <w:bookmarkStart w:id="108" w:name="vlan-estática-vs-vlan-dinámica"/>
     <w:p>
       <w:pPr>
         <w:pStyle w:val="Heading2"/>
@@ -14465,8 +14970,8 @@
         </w:pict>
       </w:r>
     </w:p>
-    <w:bookmarkEnd w:id="104"/>
-    <w:bookmarkStart w:id="106" w:name="ejemplos-reales-por-departamento"/>
+    <w:bookmarkEnd w:id="108"/>
+    <w:bookmarkStart w:id="110" w:name="ejemplos-reales-por-departamento"/>
     <w:p>
       <w:pPr>
         <w:pStyle w:val="Heading2"/>
@@ -14811,7 +15316,7 @@
         <w:t xml:space="preserve">para voz y uno además alto (999) para gestión. Es más fácil de operar y de auditar que un pufo de números consecutivos sin criterio.</w:t>
       </w:r>
     </w:p>
-    <w:bookmarkStart w:id="105" w:name="cuándo-usar-cada-tipo"/>
+    <w:bookmarkStart w:id="109" w:name="cuándo-usar-cada-tipo"/>
     <w:p>
       <w:pPr>
         <w:pStyle w:val="Heading3"/>
@@ -14905,7 +15410,7 @@
         <w:t xml:space="preserve"> </w:t>
       </w:r>
       <w:r>
-        <w:t xml:space="preserve">siempre que ataques SSH/SNMP; aíslala del tráfico de usuario y limita el acceso con ACL.</w:t>
+        <w:t xml:space="preserve">siempre que actives SSH/SNMP; aíslala del tráfico de usuario y limita el acceso con ACL.</w:t>
       </w:r>
     </w:p>
     <w:p>
@@ -14937,9 +15442,9 @@
         </w:pict>
       </w:r>
     </w:p>
-    <w:bookmarkEnd w:id="105"/>
-    <w:bookmarkEnd w:id="106"/>
-    <w:bookmarkStart w:id="107" w:name="mini-chequeo-8"/>
+    <w:bookmarkEnd w:id="109"/>
+    <w:bookmarkEnd w:id="110"/>
+    <w:bookmarkStart w:id="111" w:name="mini-chequeo-8"/>
     <w:p>
       <w:pPr>
         <w:pStyle w:val="Heading2"/>
@@ -15156,8 +15661,8 @@
         </w:pict>
       </w:r>
     </w:p>
-    <w:bookmarkEnd w:id="107"/>
-    <w:bookmarkStart w:id="108" w:name="resumen-en-3-frases-8"/>
+    <w:bookmarkEnd w:id="111"/>
+    <w:bookmarkStart w:id="112" w:name="resumen-en-3-frases-8"/>
     <w:p>
       <w:pPr>
         <w:pStyle w:val="Heading2"/>
@@ -15228,8 +15733,8 @@
         <w:t xml:space="preserve">La planificación de números con huecos (10, 20, 30…) y una VLAN alta para gestión te ahorrará dolores de cabeza.</w:t>
       </w:r>
     </w:p>
-    <w:bookmarkEnd w:id="108"/>
-    <w:bookmarkStart w:id="109" w:name="vocabulario-rápido-8"/>
+    <w:bookmarkEnd w:id="112"/>
+    <w:bookmarkStart w:id="113" w:name="vocabulario-rápido-8"/>
     <w:p>
       <w:pPr>
         <w:pStyle w:val="Heading2"/>
@@ -15524,9 +16029,9 @@
         </w:r>
       </w:hyperlink>
     </w:p>
-    <w:bookmarkEnd w:id="109"/>
-    <w:bookmarkEnd w:id="110"/>
-    <w:bookmarkStart w:id="123" w:name="cierre-consolida-lo-aprendido"/>
+    <w:bookmarkEnd w:id="113"/>
+    <w:bookmarkEnd w:id="114"/>
+    <w:bookmarkStart w:id="128" w:name="cierre-consolida-lo-aprendido"/>
     <w:p>
       <w:pPr>
         <w:pStyle w:val="Heading1"/>
@@ -15622,7 +16127,7 @@
         </w:pict>
       </w:r>
     </w:p>
-    <w:bookmarkStart w:id="111" w:name="sé-el-paquete"/>
+    <w:bookmarkStart w:id="115" w:name="sé-el-paquete"/>
     <w:p>
       <w:pPr>
         <w:pStyle w:val="Heading2"/>
@@ -15933,8 +16438,8 @@
         </w:pict>
       </w:r>
     </w:p>
-    <w:bookmarkEnd w:id="111"/>
-    <w:bookmarkStart w:id="112" w:name="X4aed929ad7b25a303bc3800fd35cefcc1440f7c"/>
+    <w:bookmarkEnd w:id="115"/>
+    <w:bookmarkStart w:id="116" w:name="X4aed929ad7b25a303bc3800fd35cefcc1440f7c"/>
     <w:p>
       <w:pPr>
         <w:pStyle w:val="Heading2"/>
@@ -16106,8 +16611,8 @@
         </w:pict>
       </w:r>
     </w:p>
-    <w:bookmarkEnd w:id="112"/>
-    <w:bookmarkStart w:id="113" w:name="quién-soy"/>
+    <w:bookmarkEnd w:id="116"/>
+    <w:bookmarkStart w:id="117" w:name="quién-soy"/>
     <w:p>
       <w:pPr>
         <w:pStyle w:val="Heading2"/>
@@ -16371,8 +16876,8 @@
         </w:pict>
       </w:r>
     </w:p>
-    <w:bookmarkEnd w:id="113"/>
-    <w:bookmarkStart w:id="114" w:name="X52b141ab8a046c8346f4c7863ea5dd22acf53b0"/>
+    <w:bookmarkEnd w:id="117"/>
+    <w:bookmarkStart w:id="119" w:name="X52b141ab8a046c8346f4c7863ea5dd22acf53b0"/>
     <w:p>
       <w:pPr>
         <w:pStyle w:val="Heading2"/>
@@ -16418,7 +16923,7 @@
         <w:t xml:space="preserve"> </w:t>
       </w:r>
       <w:r>
-        <w:t xml:space="preserve">Clásico. Configuras VLAN10 en el Switch1 y VLAN20 en el Switch2. Conectas los switches por un puerto normal (access). Los de VLAN10 no ven a los de VLAN20. ¡LÓGICO! Necesitas un TRUNK para que las VLANs viajen entre switches. Y no olvides el 802.1Q.</w:t>
+        <w:t xml:space="preserve">Clásico. Configuras VLAN 10 en el Switch1 y VLAN 20 en el Switch2. Conectas los switches por un puerto normal (access). Los de VLAN 10 no ven a los de VLAN 20. ¡LÓGICO! Necesitas un TRUNK para que las VLANs viajen entre switches. Y no olvides el 802.1Q.</w:t>
       </w:r>
     </w:p>
     <w:p>
@@ -16611,7 +17116,21 @@
         <w:t xml:space="preserve"> </w:t>
       </w:r>
       <w:r>
-        <w:t xml:space="preserve">para cruzar de VLAN. Si algo falla, recuerda el orden de diagnóstico del punto 8:</w:t>
+        <w:t xml:space="preserve">para cruzar de VLAN. Si algo falla, recuerda el orden de diagnóstico del</w:t>
+      </w:r>
+      <w:r>
+        <w:t xml:space="preserve"> </w:t>
+      </w:r>
+      <w:hyperlink r:id="rId118">
+        <w:r>
+          <w:rPr>
+            <w:rStyle w:val="Hyperlink"/>
+          </w:rPr>
+          <w:t xml:space="preserve">punto 2 de trunking e inter-VLAN</w:t>
+        </w:r>
+      </w:hyperlink>
+      <w:r>
+        <w:t xml:space="preserve">:</w:t>
       </w:r>
       <w:r>
         <w:t xml:space="preserve"> </w:t>
@@ -16663,8 +17182,8 @@
         </w:pict>
       </w:r>
     </w:p>
-    <w:bookmarkEnd w:id="114"/>
-    <w:bookmarkStart w:id="115" w:name="Xdcd154e20b63f9c0b798c9104cf5d71f332e8a5"/>
+    <w:bookmarkEnd w:id="119"/>
+    <w:bookmarkStart w:id="120" w:name="Xdcd154e20b63f9c0b798c9104cf5d71f332e8a5"/>
     <w:p>
       <w:pPr>
         <w:pStyle w:val="Heading2"/>
@@ -16770,7 +17289,7 @@
         <w:t xml:space="preserve"> </w:t>
       </w:r>
       <w:r>
-        <w:t xml:space="preserve">3. Configura el router con subinterfaces (VLAN10 y VLAN20).</w:t>
+        <w:t xml:space="preserve">3. Configura el router con subinterfaces (VLAN 10 y VLAN 20).</w:t>
       </w:r>
       <w:r>
         <w:t xml:space="preserve"> </w:t>
@@ -16816,7 +17335,7 @@
         <w:rPr>
           <w:rStyle w:val="VerbatimChar"/>
         </w:rPr>
-        <w:t xml:space="preserve">show interface trunk</w:t>
+        <w:t xml:space="preserve">show interfaces trunk</w:t>
       </w:r>
       <w:r>
         <w:t xml:space="preserve"> </w:t>
@@ -16849,7 +17368,7 @@
         <w:rPr>
           <w:rStyle w:val="VerbatimChar"/>
         </w:rPr>
-        <w:t xml:space="preserve">show interface trunk</w:t>
+        <w:t xml:space="preserve">show interfaces trunk</w:t>
       </w:r>
       <w:r>
         <w:t xml:space="preserve"> </w:t>
@@ -16966,7 +17485,7 @@
         <w:rPr>
           <w:rStyle w:val="VerbatimChar"/>
         </w:rPr>
-        <w:t xml:space="preserve">show interface trunk</w:t>
+        <w:t xml:space="preserve">show interfaces trunk</w:t>
       </w:r>
       <w:r>
         <w:t xml:space="preserve"> </w:t>
@@ -16982,8 +17501,8 @@
         </w:pict>
       </w:r>
     </w:p>
-    <w:bookmarkEnd w:id="115"/>
-    <w:bookmarkStart w:id="116" w:name="logros-de-esta-unidad"/>
+    <w:bookmarkEnd w:id="120"/>
+    <w:bookmarkStart w:id="121" w:name="logros-de-esta-unidad"/>
     <w:p>
       <w:pPr>
         <w:pStyle w:val="Heading2"/>
@@ -17102,7 +17621,7 @@
               <w:rPr>
                 <w:rStyle w:val="VerbatimChar"/>
               </w:rPr>
-              <w:t xml:space="preserve">show interface trunk</w:t>
+              <w:t xml:space="preserve">show interfaces trunk</w:t>
             </w:r>
           </w:p>
         </w:tc>
@@ -17183,8 +17702,8 @@
         </w:pict>
       </w:r>
     </w:p>
-    <w:bookmarkEnd w:id="116"/>
-    <w:bookmarkStart w:id="117" w:name="atrévete-a-pensar"/>
+    <w:bookmarkEnd w:id="121"/>
+    <w:bookmarkStart w:id="122" w:name="atrévete-a-pensar"/>
     <w:p>
       <w:pPr>
         <w:pStyle w:val="Heading2"/>
@@ -17312,7 +17831,7 @@
           <w:b/>
           <w:bCs/>
         </w:rPr>
-        <w:t xml:space="preserve">Dato contexto:</w:t>
+        <w:t xml:space="preserve">Dato de contexto:</w:t>
       </w:r>
       <w:r>
         <w:t xml:space="preserve"> </w:t>
@@ -17380,7 +17899,18 @@
         <w:t xml:space="preserve"> </w:t>
       </w:r>
       <w:r>
-        <w:t xml:space="preserve">(punto 3) para que la VLAN 10 de un lado llegue a la del otro.</w:t>
+        <w:t xml:space="preserve">(</w:t>
+      </w:r>
+      <w:hyperlink r:id="rId92">
+        <w:r>
+          <w:rPr>
+            <w:rStyle w:val="Hyperlink"/>
+          </w:rPr>
+          <w:t xml:space="preserve">trunking e inter-VLAN</w:t>
+        </w:r>
+      </w:hyperlink>
+      <w:r>
+        <w:t xml:space="preserve">) para que la VLAN 10 de un lado llegue a la del otro.</w:t>
       </w:r>
     </w:p>
     <w:p>
@@ -17477,7 +18007,21 @@
         <w:t xml:space="preserve"> </w:t>
       </w:r>
       <w:r>
-        <w:t xml:space="preserve">(decenas o cientos de VLANs o altas tasas): el router-on-a-stick se ve limitado por una única interfaz (punto 4 y 5). En oficinas pequeñas, el router-on-a-stick basta y es más barato.</w:t>
+        <w:t xml:space="preserve">(decenas o cientos de VLANs o altas tasas): el router-on-a-stick se ve limitado por una única interfaz (en</w:t>
+      </w:r>
+      <w:r>
+        <w:t xml:space="preserve"> </w:t>
+      </w:r>
+      <w:hyperlink r:id="rId97">
+        <w:r>
+          <w:rPr>
+            <w:rStyle w:val="Hyperlink"/>
+          </w:rPr>
+          <w:t xml:space="preserve">trunking e inter-VLAN</w:t>
+        </w:r>
+      </w:hyperlink>
+      <w:r>
+        <w:t xml:space="preserve">, puntos 3 y 4). En oficinas pequeñas, el router-on-a-stick basta y es más barato.</w:t>
       </w:r>
     </w:p>
     <w:p>
@@ -17540,8 +18084,8 @@
         </w:pict>
       </w:r>
     </w:p>
-    <w:bookmarkEnd w:id="117"/>
-    <w:bookmarkStart w:id="118" w:name="crucigrama-de-bits"/>
+    <w:bookmarkEnd w:id="122"/>
+    <w:bookmarkStart w:id="123" w:name="crucigrama-de-bits"/>
     <w:p>
       <w:pPr>
         <w:pStyle w:val="Heading2"/>
@@ -17585,7 +18129,7 @@
         <w:rPr>
           <w:rStyle w:val="VerbatimChar"/>
         </w:rPr>
-        <w:t xml:space="preserve">5. Switch que puede enrutar entre VLANs (4+3 letras)</w:t>
+        <w:t xml:space="preserve">5. Switch que puede enrutar entre VLANs (5 letras)</w:t>
       </w:r>
       <w:r>
         <w:br/>
@@ -17603,7 +18147,7 @@
         <w:rPr>
           <w:rStyle w:val="VerbatimChar"/>
         </w:rPr>
-        <w:t xml:space="preserve">8. Comando para la native VLAN (6 letras)</w:t>
+        <w:t xml:space="preserve">8. Primera palabra del comando de la native VLAN (10 letras)</w:t>
       </w:r>
       <w:r>
         <w:br/>
@@ -17633,7 +18177,7 @@
         <w:rPr>
           <w:rStyle w:val="VerbatimChar"/>
         </w:rPr>
-        <w:t xml:space="preserve">3. Configuración router para inter-VLAN con una interfaz (4+2+4 letras, con guiones)</w:t>
+        <w:t xml:space="preserve">3. Configuración router para inter-VLAN con una interfaz (6+2+1+5 letras, con guiones)</w:t>
       </w:r>
       <w:r>
         <w:br/>
@@ -17694,8 +18238,8 @@
         </w:pict>
       </w:r>
     </w:p>
-    <w:bookmarkEnd w:id="118"/>
-    <w:bookmarkStart w:id="119" w:name="preguntas-de-entrevista-de-trabajo"/>
+    <w:bookmarkEnd w:id="123"/>
+    <w:bookmarkStart w:id="124" w:name="preguntas-de-entrevista-de-trabajo"/>
     <w:p>
       <w:pPr>
         <w:pStyle w:val="Heading2"/>
@@ -17890,8 +18434,8 @@
         </w:pict>
       </w:r>
     </w:p>
-    <w:bookmarkEnd w:id="119"/>
-    <w:bookmarkStart w:id="120" w:name="no-hay-preguntas-tontas"/>
+    <w:bookmarkEnd w:id="124"/>
+    <w:bookmarkStart w:id="125" w:name="no-hay-preguntas-tontas"/>
     <w:p>
       <w:pPr>
         <w:pStyle w:val="Heading2"/>
@@ -18165,7 +18709,18 @@
         <w:t xml:space="preserve"> </w:t>
       </w:r>
       <w:r>
-        <w:t xml:space="preserve">(punto 7). Así un double tagging o un mismatch no te alcanza tan fácil.</w:t>
+        <w:t xml:space="preserve">(</w:t>
+      </w:r>
+      <w:hyperlink r:id="rId93">
+        <w:r>
+          <w:rPr>
+            <w:rStyle w:val="Hyperlink"/>
+          </w:rPr>
+          <w:t xml:space="preserve">punto 6 de trunking e inter-VLAN</w:t>
+        </w:r>
+      </w:hyperlink>
+      <w:r>
+        <w:t xml:space="preserve">). Así un double tagging o un mismatch no te alcanza tan fácil.</w:t>
       </w:r>
     </w:p>
     <w:p>
@@ -18255,8 +18810,8 @@
         </w:pict>
       </w:r>
     </w:p>
-    <w:bookmarkEnd w:id="120"/>
-    <w:bookmarkStart w:id="121" w:name="poscréditos"/>
+    <w:bookmarkEnd w:id="125"/>
+    <w:bookmarkStart w:id="126" w:name="poscréditos"/>
     <w:p>
       <w:pPr>
         <w:pStyle w:val="Heading2"/>
@@ -18368,14 +18923,14 @@
         </w:pict>
       </w:r>
     </w:p>
-    <w:bookmarkEnd w:id="121"/>
-    <w:bookmarkStart w:id="122" w:name="criterios-de-evaluación-cubiertos-ra5"/>
+    <w:bookmarkEnd w:id="126"/>
+    <w:bookmarkStart w:id="127" w:name="X57a93fbf6fc0c64c2f30dbd60b2a76bb386c10c"/>
     <w:p>
       <w:pPr>
         <w:pStyle w:val="Heading2"/>
       </w:pPr>
       <w:r>
-        <w:t xml:space="preserve">✅ Criterios de evaluación cubiertos (RA5)</w:t>
+        <w:t xml:space="preserve">✅ Criterios de evaluación cubiertos (RA3/RA5)</w:t>
       </w:r>
     </w:p>
     <w:p>
@@ -18448,29 +19003,29 @@
               <w:pStyle w:val="Compact"/>
             </w:pPr>
             <w:r>
-              <w:t xml:space="preserve">a)</w:t>
-            </w:r>
-          </w:p>
-        </w:tc>
-        <w:tc>
-          <w:tcPr/>
-          <w:p>
-            <w:pPr>
-              <w:pStyle w:val="Compact"/>
-            </w:pPr>
-            <w:r>
-              <w:t xml:space="preserve">Ventajas de VLANs</w:t>
-            </w:r>
-          </w:p>
-        </w:tc>
-        <w:tc>
-          <w:tcPr/>
-          <w:p>
-            <w:pPr>
-              <w:pStyle w:val="Compact"/>
-            </w:pPr>
-            <w:r>
-              <w:t xml:space="preserve">✅ Motivación, tabla de ventajas y dominios de broadcast (puntos 1-2)</w:t>
+              <w:t xml:space="preserve">RA3</w:t>
+            </w:r>
+          </w:p>
+        </w:tc>
+        <w:tc>
+          <w:tcPr/>
+          <w:p>
+            <w:pPr>
+              <w:pStyle w:val="Compact"/>
+            </w:pPr>
+            <w:r>
+              <w:t xml:space="preserve">Administración de conmutadores</w:t>
+            </w:r>
+          </w:p>
+        </w:tc>
+        <w:tc>
+          <w:tcPr/>
+          <w:p>
+            <w:pPr>
+              <w:pStyle w:val="Compact"/>
+            </w:pPr>
+            <w:r>
+              <w:t xml:space="preserve">✅ Puntos 1-2, 5-7 + ⚡ Laboratorio (punto 10)</w:t>
             </w:r>
           </w:p>
         </w:tc>
@@ -18483,29 +19038,29 @@
               <w:pStyle w:val="Compact"/>
             </w:pPr>
             <w:r>
-              <w:t xml:space="preserve">b)</w:t>
-            </w:r>
-          </w:p>
-        </w:tc>
-        <w:tc>
-          <w:tcPr/>
-          <w:p>
-            <w:pPr>
-              <w:pStyle w:val="Compact"/>
-            </w:pPr>
-            <w:r>
-              <w:t xml:space="preserve">Implementación de VLANs</w:t>
-            </w:r>
-          </w:p>
-        </w:tc>
-        <w:tc>
-          <w:tcPr/>
-          <w:p>
-            <w:pPr>
-              <w:pStyle w:val="Compact"/>
-            </w:pPr>
-            <w:r>
-              <w:t xml:space="preserve">✅ Configuración access/trunk en el ⚡ Laboratorio y puntos 2 y 8</w:t>
+              <w:t xml:space="preserve">RA3·c)</w:t>
+            </w:r>
+          </w:p>
+        </w:tc>
+        <w:tc>
+          <w:tcPr/>
+          <w:p>
+            <w:pPr>
+              <w:pStyle w:val="Compact"/>
+            </w:pPr>
+            <w:r>
+              <w:t xml:space="preserve">Redundancia sin bucles (STP)</w:t>
+            </w:r>
+          </w:p>
+        </w:tc>
+        <w:tc>
+          <w:tcPr/>
+          <w:p>
+            <w:pPr>
+              <w:pStyle w:val="Compact"/>
+            </w:pPr>
+            <w:r>
+              <w:t xml:space="preserve">✅ Puntos 4-7 + 💬 Entrevista (punto 10)</w:t>
             </w:r>
           </w:p>
         </w:tc>
@@ -18518,38 +19073,29 @@
               <w:pStyle w:val="Compact"/>
             </w:pPr>
             <w:r>
-              <w:t xml:space="preserve">c)</w:t>
-            </w:r>
-          </w:p>
-        </w:tc>
-        <w:tc>
-          <w:tcPr/>
-          <w:p>
-            <w:pPr>
-              <w:pStyle w:val="Compact"/>
-            </w:pPr>
-            <w:r>
-              <w:t xml:space="preserve">Diagnóstico de incidencias</w:t>
-            </w:r>
-          </w:p>
-        </w:tc>
-        <w:tc>
-          <w:tcPr/>
-          <w:p>
-            <w:pPr>
-              <w:pStyle w:val="Compact"/>
-            </w:pPr>
-            <w:r>
-              <w:t xml:space="preserve">✅ Fallo intencionado de native VLAN +</w:t>
-            </w:r>
-            <w:r>
-              <w:t xml:space="preserve"> </w:t>
-            </w:r>
-            <w:r>
-              <w:rPr>
-                <w:rStyle w:val="VerbatimChar"/>
-              </w:rPr>
-              <w:t xml:space="preserve">show interfaces trunk</w:t>
+              <w:t xml:space="preserve">RA5·a)</w:t>
+            </w:r>
+          </w:p>
+        </w:tc>
+        <w:tc>
+          <w:tcPr/>
+          <w:p>
+            <w:pPr>
+              <w:pStyle w:val="Compact"/>
+            </w:pPr>
+            <w:r>
+              <w:t xml:space="preserve">Ventajas de VLANs</w:t>
+            </w:r>
+          </w:p>
+        </w:tc>
+        <w:tc>
+          <w:tcPr/>
+          <w:p>
+            <w:pPr>
+              <w:pStyle w:val="Compact"/>
+            </w:pPr>
+            <w:r>
+              <w:t xml:space="preserve">✅ Puntos 3-4 y 8 (dominios y ventajas) + 🧠 Atrévete a pensar (punto 10)</w:t>
             </w:r>
           </w:p>
         </w:tc>
@@ -18562,29 +19108,29 @@
               <w:pStyle w:val="Compact"/>
             </w:pPr>
             <w:r>
-              <w:t xml:space="preserve">d)</w:t>
-            </w:r>
-          </w:p>
-        </w:tc>
-        <w:tc>
-          <w:tcPr/>
-          <w:p>
-            <w:pPr>
-              <w:pStyle w:val="Compact"/>
-            </w:pPr>
-            <w:r>
-              <w:t xml:space="preserve">Enlaces troncales</w:t>
-            </w:r>
-          </w:p>
-        </w:tc>
-        <w:tc>
-          <w:tcPr/>
-          <w:p>
-            <w:pPr>
-              <w:pStyle w:val="Compact"/>
-            </w:pPr>
-            <w:r>
-              <w:t xml:space="preserve">✅ Trunk 802.1Q y native VLAN (puntos 3 y 8)</w:t>
+              <w:t xml:space="preserve">RA5·b)</w:t>
+            </w:r>
+          </w:p>
+        </w:tc>
+        <w:tc>
+          <w:tcPr/>
+          <w:p>
+            <w:pPr>
+              <w:pStyle w:val="Compact"/>
+            </w:pPr>
+            <w:r>
+              <w:t xml:space="preserve">Implementación de VLANs</w:t>
+            </w:r>
+          </w:p>
+        </w:tc>
+        <w:tc>
+          <w:tcPr/>
+          <w:p>
+            <w:pPr>
+              <w:pStyle w:val="Compact"/>
+            </w:pPr>
+            <w:r>
+              <w:t xml:space="preserve">✅ Puntos 8-9 + ⚡ Laboratorio (punto 10)</w:t>
             </w:r>
           </w:p>
         </w:tc>
@@ -18597,29 +19143,29 @@
               <w:pStyle w:val="Compact"/>
             </w:pPr>
             <w:r>
-              <w:t xml:space="preserve">e)</w:t>
-            </w:r>
-          </w:p>
-        </w:tc>
-        <w:tc>
-          <w:tcPr/>
-          <w:p>
-            <w:pPr>
-              <w:pStyle w:val="Compact"/>
-            </w:pPr>
-            <w:r>
-              <w:t xml:space="preserve">Inter-VLAN con router</w:t>
-            </w:r>
-          </w:p>
-        </w:tc>
-        <w:tc>
-          <w:tcPr/>
-          <w:p>
-            <w:pPr>
-              <w:pStyle w:val="Compact"/>
-            </w:pPr>
-            <w:r>
-              <w:t xml:space="preserve">✅ Router-on-a-stick y SVI en el ⚡ Laboratorio</w:t>
+              <w:t xml:space="preserve">RA5·c)</w:t>
+            </w:r>
+          </w:p>
+        </w:tc>
+        <w:tc>
+          <w:tcPr/>
+          <w:p>
+            <w:pPr>
+              <w:pStyle w:val="Compact"/>
+            </w:pPr>
+            <w:r>
+              <w:t xml:space="preserve">Diagnóstico de incidencias</w:t>
+            </w:r>
+          </w:p>
+        </w:tc>
+        <w:tc>
+          <w:tcPr/>
+          <w:p>
+            <w:pPr>
+              <w:pStyle w:val="Compact"/>
+            </w:pPr>
+            <w:r>
+              <w:t xml:space="preserve">✅ Fallo intencionado de native VLAN (punto 10)</w:t>
             </w:r>
           </w:p>
         </w:tc>
@@ -18632,7 +19178,77 @@
               <w:pStyle w:val="Compact"/>
             </w:pPr>
             <w:r>
-              <w:t xml:space="preserve">f)</w:t>
+              <w:t xml:space="preserve">RA5·d)</w:t>
+            </w:r>
+          </w:p>
+        </w:tc>
+        <w:tc>
+          <w:tcPr/>
+          <w:p>
+            <w:pPr>
+              <w:pStyle w:val="Compact"/>
+            </w:pPr>
+            <w:r>
+              <w:t xml:space="preserve">Enlaces troncales</w:t>
+            </w:r>
+          </w:p>
+        </w:tc>
+        <w:tc>
+          <w:tcPr/>
+          <w:p>
+            <w:pPr>
+              <w:pStyle w:val="Compact"/>
+            </w:pPr>
+            <w:r>
+              <w:t xml:space="preserve">✅ Punto 9 (nativa) + ⭐ y 🤬 CONRAD (punto 10)</w:t>
+            </w:r>
+          </w:p>
+        </w:tc>
+      </w:tr>
+      <w:tr>
+        <w:tc>
+          <w:tcPr/>
+          <w:p>
+            <w:pPr>
+              <w:pStyle w:val="Compact"/>
+            </w:pPr>
+            <w:r>
+              <w:t xml:space="preserve">RA5·e)</w:t>
+            </w:r>
+          </w:p>
+        </w:tc>
+        <w:tc>
+          <w:tcPr/>
+          <w:p>
+            <w:pPr>
+              <w:pStyle w:val="Compact"/>
+            </w:pPr>
+            <w:r>
+              <w:t xml:space="preserve">Inter-VLAN con router</w:t>
+            </w:r>
+          </w:p>
+        </w:tc>
+        <w:tc>
+          <w:tcPr/>
+          <w:p>
+            <w:pPr>
+              <w:pStyle w:val="Compact"/>
+            </w:pPr>
+            <w:r>
+              <w:t xml:space="preserve">✅ ⚡ Laboratorio, 🕵️ y 🧠 (punto 10)</w:t>
+            </w:r>
+          </w:p>
+        </w:tc>
+      </w:tr>
+      <w:tr>
+        <w:tc>
+          <w:tcPr/>
+          <w:p>
+            <w:pPr>
+              <w:pStyle w:val="Compact"/>
+            </w:pPr>
+            <w:r>
+              <w:t xml:space="preserve">RA5·f)</w:t>
             </w:r>
           </w:p>
         </w:tc>
@@ -18654,7 +19270,7 @@
               <w:pStyle w:val="Compact"/>
             </w:pPr>
             <w:r>
-              <w:t xml:space="preserve">✅ Modos, revision number y riesgos (punto 6)</w:t>
+              <w:t xml:space="preserve">✅ 🕵️, 🧠 y 💬 (punto 10)</w:t>
             </w:r>
           </w:p>
         </w:tc>
@@ -18740,8 +19356,8 @@
         </w:r>
       </w:hyperlink>
     </w:p>
-    <w:bookmarkEnd w:id="122"/>
-    <w:bookmarkEnd w:id="123"/>
+    <w:bookmarkEnd w:id="127"/>
+    <w:bookmarkEnd w:id="128"/>
     <w:sectPr>
       <w:footnotePr>
         <w:numRestart w:val="eachSect"/>

</xml_diff>